<commit_message>
Implement premium AI Tutor experience with Quick Learn, Tutor Me and enhanced Quiz UI
</commit_message>
<xml_diff>
--- a/static/downloads/Adetola Olumide_Active Voice and Passive Voice.pdf_AI_Study_Notes.docx
+++ b/static/downloads/Adetola Olumide_Active Voice and Passive Voice.pdf_AI_Study_Notes.docx
@@ -91,97 +91,70 @@
     </w:p>
     <w:p>
       <w:r>
-        <w:t>Let’s work through active and passive voice together—it’s actually pretty straightforward once you get the hang of the idea!</w:t>
+        <w:t>Let’s work through the idea of active and passive voice together. At first, it might seem like just a fancy grammar rule, but it really helps you decide how to focus a sentence—like who’s doing the action, or what the action is affecting.</w:t>
         <w:br/>
         <w:br/>
-        <w:t>### 💡 What’s the Big Idea?</w:t>
+        <w:t>Here’s the big idea: In **active voice**, the subject is *doing* the action. For example, “The teacher explained the lesson.” Here, the teacher (the subject) is doing the explaining (the action). This is clear and direct—kind of like telling a story where the main character is busy doing things.</w:t>
         <w:br/>
         <w:br/>
-        <w:t>Active voice is when *someone* or *something* (the subject) is doing the action. Think of it like this: "The teacher explained the lesson." Here, the teacher does the action "explained" to the object "the lesson."</w:t>
+        <w:t>On the other hand, in **passive voice**, the subject is *receiving* the action. So, “The lesson was explained by the teacher.” Now the focus moves to the lesson (the subject), and the doer—the teacher—is mentioned after the action. Think of passive voice like a spotlight shining on what happened, rather than who did it.</w:t>
         <w:br/>
         <w:br/>
-        <w:t>Passive voice flips this around. The person or thing *affected* by the action becomes the subject, and the doer might come after with "by." For example, "The lesson was explained by the teacher." The lesson isn’t doing anything; it’s receiving the action.</w:t>
+        <w:t>Don’t worry if this idea feels weird at first. It’ll become clearer with a bit of practice.</w:t>
         <w:br/>
         <w:br/>
-        <w:t>Don’t worry if that feels tricky at first—it becomes easier after a few examples.</w:t>
+        <w:t>Imagine you’re in a kitchen. If you say, “The chef made the cake,” that’s active voice—you’re focusing on the chef, the person doing the baking. But if you say, “The cake was made by the chef,” suddenly, the cake takes center stage. Maybe you want to talk about the cake because it looks amazing, not the person who baked it. This switch of focus is exactly what active and passive voice do in sentences.</w:t>
         <w:br/>
         <w:br/>
-        <w:t>### 🌍 Think of It Like Cooking</w:t>
+        <w:t>Now, here’s a question for you to think about:</w:t>
         <w:br/>
         <w:br/>
-        <w:t xml:space="preserve">Imagine you're in a kitchen. In *active* voice, you say: "The chef cooked the meal." The chef (subject) is busy cooking (verb) the meal (object). </w:t>
+        <w:t>If you wanted to emphasize the action itself more than the person doing it, which voice would you use, active or passive?</w:t>
         <w:br/>
         <w:br/>
-        <w:t>In *passive* voice, the focus is on the meal: "The meal was cooked by the chef." Now, the meal is the subject, and the chef is mentioned as the doer after "by."</w:t>
+        <w:t>Take a moment to think about it.</w:t>
         <w:br/>
         <w:br/>
-        <w:t>Which way you choose depends on what you want to emphasize: the doer or the action/result.</w:t>
+        <w:t>If you thought “passive,” you’re right! Passive voice shines a spotlight on the action or the thing affected by the action. For example, in science experiments, we often use passive voice: “The experiment was conducted...” because the focus is on what was done, not on who did it.</w:t>
         <w:br/>
         <w:br/>
-        <w:t>### 🤔 Pause and Think</w:t>
+        <w:t>Let’s walk through an example to see this in action.</w:t>
         <w:br/>
         <w:br/>
-        <w:t>Why do you think someone might prefer to say "The meal was cooked by the chef" rather than "The chef cooked the meal"?</w:t>
+        <w:t>Look at this sentence in active voice: “The students wrote the exam.”</w:t>
         <w:br/>
         <w:br/>
-        <w:t>---</w:t>
+        <w:t>Step 1: Identify the object. Here, it’s “the exam.”</w:t>
         <w:br/>
         <w:br/>
-        <w:t>### ✅ Let’s Answer That</w:t>
+        <w:t>Step 2: Move the object to the subject position in the passive sentence: “The exam...”</w:t>
         <w:br/>
         <w:br/>
-        <w:t>If you said they wanted to focus on the meal, or maybe they didn’t know who cooked it, you're right! Passive voice works well when the action or result matters more than the doer, or when who did something isn’t known.</w:t>
+        <w:t>Step 3: Add the correct form of “be” (because passive voice always needs a form of “be” + past participle). Since it’s past tense, we use “was.”</w:t>
         <w:br/>
         <w:br/>
-        <w:t>### 💡 Let’s Convert One Together</w:t>
+        <w:t>Step 4: Use the past participle of the main verb “write,” which is “written.”</w:t>
         <w:br/>
         <w:br/>
-        <w:t>Active: *The students wrote the exam.*</w:t>
+        <w:t>Step 5: Add “by” and the original doer: “by the students.”</w:t>
         <w:br/>
         <w:br/>
-        <w:t>Steps:</w:t>
+        <w:t>Putting it all together: “The exam was written by the students.”</w:t>
         <w:br/>
         <w:br/>
-        <w:t>1. Move the object "the exam" to the subject spot.</w:t>
-        <w:br/>
-        <w:t>2. Add a form of "be" (for past tense, here it’s "was").</w:t>
-        <w:br/>
-        <w:t>3. Use the past participle of "write," which is "written."</w:t>
-        <w:br/>
-        <w:t>4. Finish with "by the students" (the doer).</w:t>
+        <w:t>Notice how the action (“was written”) is now the focus, and “the students” come after, introduced by “by.”</w:t>
         <w:br/>
         <w:br/>
-        <w:t>Passive: *The exam was written by the students.*</w:t>
+        <w:t>One common mistake students make is forgetting to change the verb correctly in passive sentences. For example, just moving the object to the front without adding the right form of “be” or using the past participle can make the sentence sound wrong. A simple tip: Always remember the formula—subject + form of “be” + past participle + (by + agent).</w:t>
         <w:br/>
         <w:br/>
-        <w:t>Notice how the focus switches from students (doing) to the exam (receiving).</w:t>
+        <w:t>Here’s your challenge: Take the sentence “The chef prepared the meal” and change it into passive voice. Think about each step carefully before you try it!</w:t>
         <w:br/>
         <w:br/>
-        <w:t>### ⚠ Watch Out For This Mistake</w:t>
+        <w:t>Once you’re comfortable turning active sentences into passive ones (and vice versa), try spotting the voice in other sentences around you. It’s a simple skill but really sharpens your writing.</w:t>
         <w:br/>
         <w:br/>
-        <w:t>Sometimes, people forget to add the correct form of "be" or use the past participle. Like if someone says, *The exam wrote by the students*—that’s missing the "was" and the verb form is off.</w:t>
-        <w:br/>
-        <w:br/>
-        <w:t>A simple trick: After putting the object in front, always check what form of "be" fits the tense, then use the past participle of the verb.</w:t>
-        <w:br/>
-        <w:br/>
-        <w:t>### 🎯 Your Turn</w:t>
-        <w:br/>
-        <w:br/>
-        <w:t>Try converting this active sentence to passive:</w:t>
-        <w:br/>
-        <w:br/>
-        <w:t>*The chef prepares the meal.*</w:t>
-        <w:br/>
-        <w:br/>
-        <w:t>Think about the object, the verb tense, and how the sentence should look in passive voice.</w:t>
-        <w:br/>
-        <w:br/>
-        <w:t>---</w:t>
-        <w:br/>
-        <w:br/>
-        <w:t>Once you get comfortable switching between active and passive, you’ll write clearer sentences and understand why a writer chose one voice over the other. Let’s see how you do with the challenge!</w:t>
+        <w:t>Let’s see how much you’ve understood—try the practice questions and see if you can spot and switch voices confidently!</w:t>
       </w:r>
     </w:p>
     <w:p>

</xml_diff>

<commit_message>
Add interactive flashcards with animations and improve learning experience
</commit_message>
<xml_diff>
--- a/static/downloads/Adetola Olumide_Active Voice and Passive Voice.pdf_AI_Study_Notes.docx
+++ b/static/downloads/Adetola Olumide_Active Voice and Passive Voice.pdf_AI_Study_Notes.docx
@@ -91,70 +91,133 @@
     </w:p>
     <w:p>
       <w:r>
-        <w:t>Let’s work through the idea of active and passive voice together. At first, it might seem like just a fancy grammar rule, but it really helps you decide how to focus a sentence—like who’s doing the action, or what the action is affecting.</w:t>
+        <w:t>Let’s work through active and passive voice together—it might sound tricky at first, but once you get the hang of it, it’s really just about who’s doing the action and who’s receiving it.</w:t>
         <w:br/>
         <w:br/>
-        <w:t>Here’s the big idea: In **active voice**, the subject is *doing* the action. For example, “The teacher explained the lesson.” Here, the teacher (the subject) is doing the explaining (the action). This is clear and direct—kind of like telling a story where the main character is busy doing things.</w:t>
+        <w:t>### 💡 The Big Idea</w:t>
         <w:br/>
         <w:br/>
-        <w:t>On the other hand, in **passive voice**, the subject is *receiving* the action. So, “The lesson was explained by the teacher.” Now the focus moves to the lesson (the subject), and the doer—the teacher—is mentioned after the action. Think of passive voice like a spotlight shining on what happened, rather than who did it.</w:t>
+        <w:t>Active voice means the subject (someone or something) is **doing** the action. For example, “The teacher explained the lesson.” Here, the teacher is doing something—explaining.</w:t>
         <w:br/>
         <w:br/>
-        <w:t>Don’t worry if this idea feels weird at first. It’ll become clearer with a bit of practice.</w:t>
+        <w:t>Passive voice flips it: the subject **receives** the action. So, “The lesson was explained by the teacher.” The lesson isn't doing anything; it's getting explained.</w:t>
         <w:br/>
         <w:br/>
-        <w:t>Imagine you’re in a kitchen. If you say, “The chef made the cake,” that’s active voice—you’re focusing on the chef, the person doing the baking. But if you say, “The cake was made by the chef,” suddenly, the cake takes center stage. Maybe you want to talk about the cake because it looks amazing, not the person who baked it. This switch of focus is exactly what active and passive voice do in sentences.</w:t>
+        <w:t>Don’t worry if this seems a bit confusing now—it clicks quickly when you practice!</w:t>
         <w:br/>
         <w:br/>
-        <w:t>Now, here’s a question for you to think about:</w:t>
+        <w:t>### 🌍 How to Think About It</w:t>
         <w:br/>
         <w:br/>
-        <w:t>If you wanted to emphasize the action itself more than the person doing it, which voice would you use, active or passive?</w:t>
+        <w:t>Imagine you’re baking a cake with a friend. In active voice, you say, “I baked the cake.” You’re the doer. That’s simple and clear!</w:t>
         <w:br/>
         <w:br/>
-        <w:t>Take a moment to think about it.</w:t>
+        <w:t>In passive voice, it would be, “The cake was baked by me.” Now the cake is the focus, and who did it is added later (or sometimes left out).</w:t>
         <w:br/>
         <w:br/>
-        <w:t>If you thought “passive,” you’re right! Passive voice shines a spotlight on the action or the thing affected by the action. For example, in science experiments, we often use passive voice: “The experiment was conducted...” because the focus is on what was done, not on who did it.</w:t>
+        <w:t>### 🤔 Quick Question</w:t>
         <w:br/>
         <w:br/>
-        <w:t>Let’s walk through an example to see this in action.</w:t>
+        <w:t>If I say, “The window was broken,” is the sentence active or passive?</w:t>
         <w:br/>
         <w:br/>
-        <w:t>Look at this sentence in active voice: “The students wrote the exam.”</w:t>
+        <w:t>---</w:t>
         <w:br/>
         <w:br/>
-        <w:t>Step 1: Identify the object. Here, it’s “the exam.”</w:t>
+        <w:t>### ✅ That’s Passive</w:t>
         <w:br/>
         <w:br/>
-        <w:t>Step 2: Move the object to the subject position in the passive sentence: “The exam...”</w:t>
+        <w:t>You probably noticed the window isn’t doing anything—it’s just receiving the action. So, it’s passive because the window is the subject but not the doer.</w:t>
         <w:br/>
         <w:br/>
-        <w:t>Step 3: Add the correct form of “be” (because passive voice always needs a form of “be” + past participle). Since it’s past tense, we use “was.”</w:t>
+        <w:t>### 💡 Turning Active Into Passive</w:t>
         <w:br/>
         <w:br/>
-        <w:t>Step 4: Use the past participle of the main verb “write,” which is “written.”</w:t>
+        <w:t>Let’s try to change an active sentence into passive:</w:t>
         <w:br/>
         <w:br/>
-        <w:t>Step 5: Add “by” and the original doer: “by the students.”</w:t>
+        <w:t>Active: “The students wrote the exam.”</w:t>
         <w:br/>
         <w:br/>
-        <w:t>Putting it all together: “The exam was written by the students.”</w:t>
+        <w:t>Step 1: Identify the object—what got written? “The exam.”</w:t>
         <w:br/>
         <w:br/>
-        <w:t>Notice how the action (“was written”) is now the focus, and “the students” come after, introduced by “by.”</w:t>
+        <w:t>Step 2: That object moves to the front—it becomes the new subject.</w:t>
         <w:br/>
         <w:br/>
-        <w:t>One common mistake students make is forgetting to change the verb correctly in passive sentences. For example, just moving the object to the front without adding the right form of “be” or using the past participle can make the sentence sound wrong. A simple tip: Always remember the formula—subject + form of “be” + past participle + (by + agent).</w:t>
+        <w:t>Step 3: Add a form of “be” in the right tense (here, past tense is “was”).</w:t>
         <w:br/>
         <w:br/>
-        <w:t>Here’s your challenge: Take the sentence “The chef prepared the meal” and change it into passive voice. Think about each step carefully before you try it!</w:t>
+        <w:t>Step 4: Use the past participle of the verb (“write” → “written”).</w:t>
         <w:br/>
         <w:br/>
-        <w:t>Once you’re comfortable turning active sentences into passive ones (and vice versa), try spotting the voice in other sentences around you. It’s a simple skill but really sharpens your writing.</w:t>
+        <w:t>Add the doer with “by” if you want.</w:t>
         <w:br/>
         <w:br/>
-        <w:t>Let’s see how much you’ve understood—try the practice questions and see if you can spot and switch voices confidently!</w:t>
+        <w:t>Passive: “The exam was written by the students.”</w:t>
+        <w:br/>
+        <w:br/>
+        <w:t>See? It’s like rearranging puzzle pieces carefully.</w:t>
+        <w:br/>
+        <w:br/>
+        <w:t>### 💡 A Worked Example</w:t>
+        <w:br/>
+        <w:br/>
+        <w:t>Active: “The chef prepared the meal.”</w:t>
+        <w:br/>
+        <w:br/>
+        <w:t>Let’s change it.</w:t>
+        <w:br/>
+        <w:br/>
+        <w:t>Step 1: Find the object—“the meal.”</w:t>
+        <w:br/>
+        <w:br/>
+        <w:t>Step 2: Move it to the subject position: “The meal...”</w:t>
+        <w:br/>
+        <w:br/>
+        <w:t>Step 3: Add the past tense form of “be”: “was”</w:t>
+        <w:br/>
+        <w:br/>
+        <w:t>Step 4: Past participle of “prepare” is “prepared.”</w:t>
+        <w:br/>
+        <w:br/>
+        <w:t>Step 5: Add “by the chef.”</w:t>
+        <w:br/>
+        <w:br/>
+        <w:t>Passive: “The meal was prepared by the chef.”</w:t>
+        <w:br/>
+        <w:br/>
+        <w:t>Easy when you break it down, right?</w:t>
+        <w:br/>
+        <w:br/>
+        <w:t>### ⚠ Common Mistakes</w:t>
+        <w:br/>
+        <w:br/>
+        <w:t>A lot of people forget to change the verb correctly into its past participle form. For example, using “prepared” vs. “prepare.”</w:t>
+        <w:br/>
+        <w:br/>
+        <w:t>Also, sometimes people forget to include the correct form of “be,” like “was” or “were,” which makes the sentence sound wrong.</w:t>
+        <w:br/>
+        <w:br/>
+        <w:t>Tip: Always identify the tense of the active sentence first to pick the right “be” verb.</w:t>
+        <w:br/>
+        <w:br/>
+        <w:t>### 🎯 Your Turn</w:t>
+        <w:br/>
+        <w:br/>
+        <w:t>Try converting this active sentence into passive:</w:t>
+        <w:br/>
+        <w:br/>
+        <w:t>“The police arrested the suspect.”</w:t>
+        <w:br/>
+        <w:br/>
+        <w:t>Take your time thinking about what the object is and what tense to use.</w:t>
+        <w:br/>
+        <w:br/>
+        <w:t>---</w:t>
+        <w:br/>
+        <w:br/>
+        <w:t>Once you’re comfortable with that, try spotting active and passive sentences around you—in books, sports commentary, or even conversations. It makes learning a bit more fun!</w:t>
       </w:r>
     </w:p>
     <w:p>

</xml_diff>